<commit_message>
feat: DocSpace 6.1 product features and cleanup
Add people registry, drafts/history, BR validation (CPF/CNPJ/CEP), canvas e-signature, client share-fill links, and admin template catalog. Archive historical hotfixes under docs/ and deploy-ready API/Pages wiring.
</commit_message>
<xml_diff>
--- a/modelos/contrato_com_conjuge.docx
+++ b/modelos/contrato_com_conjuge.docx
@@ -47,7 +47,25 @@
           <w:b/>
           <w:sz w:val="20"/>
         </w:rPr>
-        <w:t>{{nome_comandante}}</w:t>
+        <w:t>{{</w:t>
+      </w:r>
+      <w:proofErr w:type="spellStart"/>
+      <w:r>
+        <w:rPr>
+          <w:rFonts w:ascii="Times New Roman" w:hAnsi="Times New Roman"/>
+          <w:b/>
+          <w:sz w:val="20"/>
+        </w:rPr>
+        <w:t>nome_comandante</w:t>
+      </w:r>
+      <w:proofErr w:type="spellEnd"/>
+      <w:r>
+        <w:rPr>
+          <w:rFonts w:ascii="Times New Roman" w:hAnsi="Times New Roman"/>
+          <w:b/>
+          <w:sz w:val="20"/>
+        </w:rPr>
+        <w:t>}}</w:t>
       </w:r>
       <w:r>
         <w:rPr>
@@ -63,7 +81,25 @@
           <w:b/>
           <w:sz w:val="20"/>
         </w:rPr>
-        <w:t>{{estado_civil_comandante}}</w:t>
+        <w:t>{{</w:t>
+      </w:r>
+      <w:proofErr w:type="spellStart"/>
+      <w:r>
+        <w:rPr>
+          <w:rFonts w:ascii="Times New Roman" w:hAnsi="Times New Roman"/>
+          <w:b/>
+          <w:sz w:val="20"/>
+        </w:rPr>
+        <w:t>estado_civil_comandante</w:t>
+      </w:r>
+      <w:proofErr w:type="spellEnd"/>
+      <w:r>
+        <w:rPr>
+          <w:rFonts w:ascii="Times New Roman" w:hAnsi="Times New Roman"/>
+          <w:b/>
+          <w:sz w:val="20"/>
+        </w:rPr>
+        <w:t>}}</w:t>
       </w:r>
       <w:r>
         <w:rPr>
@@ -81,6 +117,7 @@
         </w:rPr>
         <w:t>{{</w:t>
       </w:r>
+      <w:proofErr w:type="spellStart"/>
       <w:r>
         <w:rPr>
           <w:rFonts w:ascii="Times New Roman" w:hAnsi="Times New Roman" w:cs="Times New Roman"/>
@@ -90,6 +127,7 @@
         </w:rPr>
         <w:t>profissao_comandante</w:t>
       </w:r>
+      <w:proofErr w:type="spellEnd"/>
       <w:r>
         <w:rPr>
           <w:rFonts w:ascii="Times New Roman" w:hAnsi="Times New Roman" w:cs="Times New Roman"/>
@@ -113,7 +151,25 @@
           <w:b/>
           <w:sz w:val="20"/>
         </w:rPr>
-        <w:t>RG: {{rg_comandante}}</w:t>
+        <w:t>RG: {{</w:t>
+      </w:r>
+      <w:proofErr w:type="spellStart"/>
+      <w:r>
+        <w:rPr>
+          <w:rFonts w:ascii="Times New Roman" w:hAnsi="Times New Roman"/>
+          <w:b/>
+          <w:sz w:val="20"/>
+        </w:rPr>
+        <w:t>rg_comandante</w:t>
+      </w:r>
+      <w:proofErr w:type="spellEnd"/>
+      <w:r>
+        <w:rPr>
+          <w:rFonts w:ascii="Times New Roman" w:hAnsi="Times New Roman"/>
+          <w:b/>
+          <w:sz w:val="20"/>
+        </w:rPr>
+        <w:t>}}</w:t>
       </w:r>
       <w:r>
         <w:rPr>
@@ -143,7 +199,25 @@
           <w:b/>
           <w:sz w:val="20"/>
         </w:rPr>
-        <w:t>CPF: {{cpf_comandante}}</w:t>
+        <w:t>CPF: {{</w:t>
+      </w:r>
+      <w:proofErr w:type="spellStart"/>
+      <w:r>
+        <w:rPr>
+          <w:rFonts w:ascii="Times New Roman" w:hAnsi="Times New Roman"/>
+          <w:b/>
+          <w:sz w:val="20"/>
+        </w:rPr>
+        <w:t>cpf_comandante</w:t>
+      </w:r>
+      <w:proofErr w:type="spellEnd"/>
+      <w:r>
+        <w:rPr>
+          <w:rFonts w:ascii="Times New Roman" w:hAnsi="Times New Roman"/>
+          <w:b/>
+          <w:sz w:val="20"/>
+        </w:rPr>
+        <w:t>}}</w:t>
       </w:r>
       <w:r>
         <w:rPr>
@@ -158,7 +232,25 @@
           <w:b/>
           <w:sz w:val="20"/>
         </w:rPr>
-        <w:t>{{localidade_comandante}}</w:t>
+        <w:t>{{</w:t>
+      </w:r>
+      <w:proofErr w:type="spellStart"/>
+      <w:r>
+        <w:rPr>
+          <w:rFonts w:ascii="Times New Roman" w:hAnsi="Times New Roman"/>
+          <w:b/>
+          <w:sz w:val="20"/>
+        </w:rPr>
+        <w:t>localidade_comandante</w:t>
+      </w:r>
+      <w:proofErr w:type="spellEnd"/>
+      <w:r>
+        <w:rPr>
+          <w:rFonts w:ascii="Times New Roman" w:hAnsi="Times New Roman"/>
+          <w:b/>
+          <w:sz w:val="20"/>
+        </w:rPr>
+        <w:t>}}</w:t>
       </w:r>
       <w:r>
         <w:rPr>
@@ -188,7 +280,25 @@
           <w:b/>
           <w:sz w:val="20"/>
         </w:rPr>
-        <w:t>{{nome_comandatario}}</w:t>
+        <w:t>{{</w:t>
+      </w:r>
+      <w:proofErr w:type="spellStart"/>
+      <w:r>
+        <w:rPr>
+          <w:rFonts w:ascii="Times New Roman" w:hAnsi="Times New Roman"/>
+          <w:b/>
+          <w:sz w:val="20"/>
+        </w:rPr>
+        <w:t>nome_comandatario</w:t>
+      </w:r>
+      <w:proofErr w:type="spellEnd"/>
+      <w:r>
+        <w:rPr>
+          <w:rFonts w:ascii="Times New Roman" w:hAnsi="Times New Roman"/>
+          <w:b/>
+          <w:sz w:val="20"/>
+        </w:rPr>
+        <w:t>}}</w:t>
       </w:r>
       <w:r>
         <w:rPr>
@@ -219,7 +329,25 @@
           <w:b/>
           <w:sz w:val="20"/>
         </w:rPr>
-        <w:t>{{estado_civil_comandatario}}</w:t>
+        <w:t>{{</w:t>
+      </w:r>
+      <w:proofErr w:type="spellStart"/>
+      <w:r>
+        <w:rPr>
+          <w:rFonts w:ascii="Times New Roman" w:hAnsi="Times New Roman"/>
+          <w:b/>
+          <w:sz w:val="20"/>
+        </w:rPr>
+        <w:t>estado_civil_comandatario</w:t>
+      </w:r>
+      <w:proofErr w:type="spellEnd"/>
+      <w:r>
+        <w:rPr>
+          <w:rFonts w:ascii="Times New Roman" w:hAnsi="Times New Roman"/>
+          <w:b/>
+          <w:sz w:val="20"/>
+        </w:rPr>
+        <w:t>}}</w:t>
       </w:r>
       <w:bookmarkEnd w:id="1"/>
       <w:r>
@@ -235,7 +363,25 @@
           <w:b/>
           <w:sz w:val="20"/>
         </w:rPr>
-        <w:t>{{profissao_comandatario}}</w:t>
+        <w:t>{{</w:t>
+      </w:r>
+      <w:proofErr w:type="spellStart"/>
+      <w:r>
+        <w:rPr>
+          <w:rFonts w:ascii="Times New Roman" w:hAnsi="Times New Roman"/>
+          <w:b/>
+          <w:sz w:val="20"/>
+        </w:rPr>
+        <w:t>profissao_comandatario</w:t>
+      </w:r>
+      <w:proofErr w:type="spellEnd"/>
+      <w:r>
+        <w:rPr>
+          <w:rFonts w:ascii="Times New Roman" w:hAnsi="Times New Roman"/>
+          <w:b/>
+          <w:sz w:val="20"/>
+        </w:rPr>
+        <w:t>}}</w:t>
       </w:r>
       <w:r>
         <w:rPr>
@@ -250,7 +396,25 @@
           <w:b/>
           <w:sz w:val="20"/>
         </w:rPr>
-        <w:t>RG: {{rg_comandatario}}</w:t>
+        <w:t>RG: {{</w:t>
+      </w:r>
+      <w:proofErr w:type="spellStart"/>
+      <w:r>
+        <w:rPr>
+          <w:rFonts w:ascii="Times New Roman" w:hAnsi="Times New Roman"/>
+          <w:b/>
+          <w:sz w:val="20"/>
+        </w:rPr>
+        <w:t>rg_comandatario</w:t>
+      </w:r>
+      <w:proofErr w:type="spellEnd"/>
+      <w:r>
+        <w:rPr>
+          <w:rFonts w:ascii="Times New Roman" w:hAnsi="Times New Roman"/>
+          <w:b/>
+          <w:sz w:val="20"/>
+        </w:rPr>
+        <w:t>}}</w:t>
       </w:r>
       <w:r>
         <w:rPr>
@@ -280,7 +444,25 @@
           <w:b/>
           <w:sz w:val="20"/>
         </w:rPr>
-        <w:t>CPF/MF: {{cpf_comandatario}}</w:t>
+        <w:t>CPF/MF: {{</w:t>
+      </w:r>
+      <w:proofErr w:type="spellStart"/>
+      <w:r>
+        <w:rPr>
+          <w:rFonts w:ascii="Times New Roman" w:hAnsi="Times New Roman"/>
+          <w:b/>
+          <w:sz w:val="20"/>
+        </w:rPr>
+        <w:t>cpf_comandatario</w:t>
+      </w:r>
+      <w:proofErr w:type="spellEnd"/>
+      <w:r>
+        <w:rPr>
+          <w:rFonts w:ascii="Times New Roman" w:hAnsi="Times New Roman"/>
+          <w:b/>
+          <w:sz w:val="20"/>
+        </w:rPr>
+        <w:t>}}</w:t>
       </w:r>
       <w:r>
         <w:rPr>
@@ -295,7 +477,25 @@
           <w:b/>
           <w:sz w:val="20"/>
         </w:rPr>
-        <w:t>{{localidade_comandatario}}</w:t>
+        <w:t>{{</w:t>
+      </w:r>
+      <w:proofErr w:type="spellStart"/>
+      <w:r>
+        <w:rPr>
+          <w:rFonts w:ascii="Times New Roman" w:hAnsi="Times New Roman"/>
+          <w:b/>
+          <w:sz w:val="20"/>
+        </w:rPr>
+        <w:t>localidade_comandatario</w:t>
+      </w:r>
+      <w:proofErr w:type="spellEnd"/>
+      <w:r>
+        <w:rPr>
+          <w:rFonts w:ascii="Times New Roman" w:hAnsi="Times New Roman"/>
+          <w:b/>
+          <w:sz w:val="20"/>
+        </w:rPr>
+        <w:t>}}</w:t>
       </w:r>
       <w:r>
         <w:rPr>
@@ -310,7 +510,25 @@
           <w:b/>
           <w:sz w:val="20"/>
         </w:rPr>
-        <w:t>{{localidade_proxima_comandatario}}</w:t>
+        <w:t>{{</w:t>
+      </w:r>
+      <w:proofErr w:type="spellStart"/>
+      <w:r>
+        <w:rPr>
+          <w:rFonts w:ascii="Times New Roman" w:hAnsi="Times New Roman"/>
+          <w:b/>
+          <w:sz w:val="20"/>
+        </w:rPr>
+        <w:t>localidade_proxima_comandatario</w:t>
+      </w:r>
+      <w:proofErr w:type="spellEnd"/>
+      <w:r>
+        <w:rPr>
+          <w:rFonts w:ascii="Times New Roman" w:hAnsi="Times New Roman"/>
+          <w:b/>
+          <w:sz w:val="20"/>
+        </w:rPr>
+        <w:t>}}</w:t>
       </w:r>
       <w:r>
         <w:rPr>
@@ -325,7 +543,25 @@
           <w:b/>
           <w:sz w:val="20"/>
         </w:rPr>
-        <w:t>{{municipio_comandatario}}</w:t>
+        <w:t>{{</w:t>
+      </w:r>
+      <w:proofErr w:type="spellStart"/>
+      <w:r>
+        <w:rPr>
+          <w:rFonts w:ascii="Times New Roman" w:hAnsi="Times New Roman"/>
+          <w:b/>
+          <w:sz w:val="20"/>
+        </w:rPr>
+        <w:t>municipio_comandatario</w:t>
+      </w:r>
+      <w:proofErr w:type="spellEnd"/>
+      <w:r>
+        <w:rPr>
+          <w:rFonts w:ascii="Times New Roman" w:hAnsi="Times New Roman"/>
+          <w:b/>
+          <w:sz w:val="20"/>
+        </w:rPr>
+        <w:t>}}</w:t>
       </w:r>
       <w:r>
         <w:rPr>
@@ -340,7 +576,25 @@
           <w:b/>
           <w:sz w:val="20"/>
         </w:rPr>
-        <w:t>{{nome_conjuge}}</w:t>
+        <w:t>{{</w:t>
+      </w:r>
+      <w:proofErr w:type="spellStart"/>
+      <w:r>
+        <w:rPr>
+          <w:rFonts w:ascii="Times New Roman" w:hAnsi="Times New Roman"/>
+          <w:b/>
+          <w:sz w:val="20"/>
+        </w:rPr>
+        <w:t>nome_conjuge</w:t>
+      </w:r>
+      <w:proofErr w:type="spellEnd"/>
+      <w:r>
+        <w:rPr>
+          <w:rFonts w:ascii="Times New Roman" w:hAnsi="Times New Roman"/>
+          <w:b/>
+          <w:sz w:val="20"/>
+        </w:rPr>
+        <w:t>}}</w:t>
       </w:r>
       <w:r>
         <w:rPr>
@@ -355,7 +609,25 @@
           <w:b/>
           <w:sz w:val="20"/>
         </w:rPr>
-        <w:t>{{nacionalidade_conjuge}}</w:t>
+        <w:t>{{</w:t>
+      </w:r>
+      <w:proofErr w:type="spellStart"/>
+      <w:r>
+        <w:rPr>
+          <w:rFonts w:ascii="Times New Roman" w:hAnsi="Times New Roman"/>
+          <w:b/>
+          <w:sz w:val="20"/>
+        </w:rPr>
+        <w:t>nacionalidade_conjuge</w:t>
+      </w:r>
+      <w:proofErr w:type="spellEnd"/>
+      <w:r>
+        <w:rPr>
+          <w:rFonts w:ascii="Times New Roman" w:hAnsi="Times New Roman"/>
+          <w:b/>
+          <w:sz w:val="20"/>
+        </w:rPr>
+        <w:t>}}</w:t>
       </w:r>
       <w:r>
         <w:rPr>
@@ -370,7 +642,25 @@
           <w:b/>
           <w:sz w:val="20"/>
         </w:rPr>
-        <w:t>{{estado_civil_conjuge}}</w:t>
+        <w:t>{{</w:t>
+      </w:r>
+      <w:proofErr w:type="spellStart"/>
+      <w:r>
+        <w:rPr>
+          <w:rFonts w:ascii="Times New Roman" w:hAnsi="Times New Roman"/>
+          <w:b/>
+          <w:sz w:val="20"/>
+        </w:rPr>
+        <w:t>estado_civil_conjuge</w:t>
+      </w:r>
+      <w:proofErr w:type="spellEnd"/>
+      <w:r>
+        <w:rPr>
+          <w:rFonts w:ascii="Times New Roman" w:hAnsi="Times New Roman"/>
+          <w:b/>
+          <w:sz w:val="20"/>
+        </w:rPr>
+        <w:t>}}</w:t>
       </w:r>
       <w:r>
         <w:rPr>
@@ -385,7 +675,25 @@
           <w:b/>
           <w:sz w:val="20"/>
         </w:rPr>
-        <w:t>{{profissao_conjuge}}</w:t>
+        <w:t>{{</w:t>
+      </w:r>
+      <w:proofErr w:type="spellStart"/>
+      <w:r>
+        <w:rPr>
+          <w:rFonts w:ascii="Times New Roman" w:hAnsi="Times New Roman"/>
+          <w:b/>
+          <w:sz w:val="20"/>
+        </w:rPr>
+        <w:t>profissao_conjuge</w:t>
+      </w:r>
+      <w:proofErr w:type="spellEnd"/>
+      <w:r>
+        <w:rPr>
+          <w:rFonts w:ascii="Times New Roman" w:hAnsi="Times New Roman"/>
+          <w:b/>
+          <w:sz w:val="20"/>
+        </w:rPr>
+        <w:t>}}</w:t>
       </w:r>
       <w:r>
         <w:rPr>
@@ -400,7 +708,25 @@
           <w:b/>
           <w:sz w:val="20"/>
         </w:rPr>
-        <w:t>RG: {{rg_conjuge}}</w:t>
+        <w:t>RG: {{</w:t>
+      </w:r>
+      <w:proofErr w:type="spellStart"/>
+      <w:r>
+        <w:rPr>
+          <w:rFonts w:ascii="Times New Roman" w:hAnsi="Times New Roman"/>
+          <w:b/>
+          <w:sz w:val="20"/>
+        </w:rPr>
+        <w:t>rg_conjuge</w:t>
+      </w:r>
+      <w:proofErr w:type="spellEnd"/>
+      <w:r>
+        <w:rPr>
+          <w:rFonts w:ascii="Times New Roman" w:hAnsi="Times New Roman"/>
+          <w:b/>
+          <w:sz w:val="20"/>
+        </w:rPr>
+        <w:t>}}</w:t>
       </w:r>
       <w:r>
         <w:rPr>
@@ -430,7 +756,25 @@
           <w:b/>
           <w:sz w:val="20"/>
         </w:rPr>
-        <w:t>CPF/MF: {{cpf_conjuge}}</w:t>
+        <w:t>CPF/MF: {{</w:t>
+      </w:r>
+      <w:proofErr w:type="spellStart"/>
+      <w:r>
+        <w:rPr>
+          <w:rFonts w:ascii="Times New Roman" w:hAnsi="Times New Roman"/>
+          <w:b/>
+          <w:sz w:val="20"/>
+        </w:rPr>
+        <w:t>cpf_conjuge</w:t>
+      </w:r>
+      <w:proofErr w:type="spellEnd"/>
+      <w:r>
+        <w:rPr>
+          <w:rFonts w:ascii="Times New Roman" w:hAnsi="Times New Roman"/>
+          <w:b/>
+          <w:sz w:val="20"/>
+        </w:rPr>
+        <w:t>}}</w:t>
       </w:r>
       <w:r>
         <w:rPr>
@@ -445,7 +789,25 @@
           <w:b/>
           <w:sz w:val="20"/>
         </w:rPr>
-        <w:t>{{localidade_conjuge}}</w:t>
+        <w:t>{{</w:t>
+      </w:r>
+      <w:proofErr w:type="spellStart"/>
+      <w:r>
+        <w:rPr>
+          <w:rFonts w:ascii="Times New Roman" w:hAnsi="Times New Roman"/>
+          <w:b/>
+          <w:sz w:val="20"/>
+        </w:rPr>
+        <w:t>localidade_conjuge</w:t>
+      </w:r>
+      <w:proofErr w:type="spellEnd"/>
+      <w:r>
+        <w:rPr>
+          <w:rFonts w:ascii="Times New Roman" w:hAnsi="Times New Roman"/>
+          <w:b/>
+          <w:sz w:val="20"/>
+        </w:rPr>
+        <w:t>}}</w:t>
       </w:r>
       <w:r>
         <w:rPr>
@@ -460,7 +822,25 @@
           <w:b/>
           <w:sz w:val="20"/>
         </w:rPr>
-        <w:t>{{localidade_proxima_conjuge}}</w:t>
+        <w:t>{{</w:t>
+      </w:r>
+      <w:proofErr w:type="spellStart"/>
+      <w:r>
+        <w:rPr>
+          <w:rFonts w:ascii="Times New Roman" w:hAnsi="Times New Roman"/>
+          <w:b/>
+          <w:sz w:val="20"/>
+        </w:rPr>
+        <w:t>localidade_proxima_conjuge</w:t>
+      </w:r>
+      <w:proofErr w:type="spellEnd"/>
+      <w:r>
+        <w:rPr>
+          <w:rFonts w:ascii="Times New Roman" w:hAnsi="Times New Roman"/>
+          <w:b/>
+          <w:sz w:val="20"/>
+        </w:rPr>
+        <w:t>}}</w:t>
       </w:r>
       <w:r>
         <w:rPr>
@@ -475,7 +855,25 @@
           <w:b/>
           <w:sz w:val="20"/>
         </w:rPr>
-        <w:t>{{municipio_conjuge}}</w:t>
+        <w:t>{{</w:t>
+      </w:r>
+      <w:proofErr w:type="spellStart"/>
+      <w:r>
+        <w:rPr>
+          <w:rFonts w:ascii="Times New Roman" w:hAnsi="Times New Roman"/>
+          <w:b/>
+          <w:sz w:val="20"/>
+        </w:rPr>
+        <w:t>municipio_conjuge</w:t>
+      </w:r>
+      <w:proofErr w:type="spellEnd"/>
+      <w:r>
+        <w:rPr>
+          <w:rFonts w:ascii="Times New Roman" w:hAnsi="Times New Roman"/>
+          <w:b/>
+          <w:sz w:val="20"/>
+        </w:rPr>
+        <w:t>}}</w:t>
       </w:r>
       <w:r>
         <w:rPr>
@@ -551,6 +949,7 @@
         </w:rPr>
         <w:t>{{</w:t>
       </w:r>
+      <w:proofErr w:type="spellStart"/>
       <w:r>
         <w:rPr>
           <w:rFonts w:ascii="Times New Roman" w:hAnsi="Times New Roman" w:cs="Times New Roman"/>
@@ -560,6 +959,7 @@
         </w:rPr>
         <w:t>nome_imovel</w:t>
       </w:r>
+      <w:proofErr w:type="spellEnd"/>
       <w:r>
         <w:rPr>
           <w:rFonts w:ascii="Times New Roman" w:hAnsi="Times New Roman" w:cs="Times New Roman"/>
@@ -603,6 +1003,7 @@
         </w:rPr>
         <w:t>{{</w:t>
       </w:r>
+      <w:proofErr w:type="spellStart"/>
       <w:r>
         <w:rPr>
           <w:rFonts w:ascii="Times New Roman" w:hAnsi="Times New Roman" w:cs="Times New Roman"/>
@@ -612,6 +1013,7 @@
         </w:rPr>
         <w:t>localidade_imovel_rural</w:t>
       </w:r>
+      <w:proofErr w:type="spellEnd"/>
       <w:r>
         <w:rPr>
           <w:rFonts w:ascii="Times New Roman" w:hAnsi="Times New Roman" w:cs="Times New Roman"/>
@@ -645,6 +1047,7 @@
         </w:rPr>
         <w:t xml:space="preserve"> cadastrado na Receita Federal com NIRF</w:t>
       </w:r>
+      <w:proofErr w:type="gramStart"/>
       <w:r>
         <w:rPr>
           <w:rFonts w:ascii="Times New Roman" w:hAnsi="Times New Roman" w:cs="Times New Roman"/>
@@ -670,30 +1073,87 @@
           <w:sz w:val="20"/>
           <w:szCs w:val="24"/>
         </w:rPr>
+        <w:t>{</w:t>
+      </w:r>
+      <w:proofErr w:type="gramEnd"/>
+      <w:r>
+        <w:rPr>
+          <w:rFonts w:ascii="Times New Roman" w:hAnsi="Times New Roman" w:cs="Times New Roman"/>
+          <w:b/>
+          <w:sz w:val="20"/>
+          <w:szCs w:val="24"/>
+        </w:rPr>
+        <w:t>{</w:t>
+      </w:r>
+      <w:proofErr w:type="spellStart"/>
+      <w:r>
+        <w:rPr>
+          <w:rFonts w:ascii="Times New Roman" w:hAnsi="Times New Roman" w:cs="Times New Roman"/>
+          <w:b/>
+          <w:sz w:val="20"/>
+          <w:szCs w:val="24"/>
+        </w:rPr>
+        <w:t>nirf_terra</w:t>
+      </w:r>
+      <w:proofErr w:type="spellEnd"/>
+      <w:r>
+        <w:rPr>
+          <w:rFonts w:ascii="Times New Roman" w:hAnsi="Times New Roman" w:cs="Times New Roman"/>
+          <w:b/>
+          <w:sz w:val="20"/>
+          <w:szCs w:val="24"/>
+        </w:rPr>
+        <w:t>}}</w:t>
+      </w:r>
+      <w:r>
+        <w:rPr>
+          <w:rFonts w:ascii="Times New Roman" w:hAnsi="Times New Roman" w:cs="Times New Roman"/>
+          <w:b/>
+          <w:sz w:val="20"/>
+          <w:szCs w:val="24"/>
+        </w:rPr>
+        <w:t xml:space="preserve"> </w:t>
+      </w:r>
+      <w:r>
+        <w:rPr>
+          <w:rFonts w:ascii="Times New Roman" w:hAnsi="Times New Roman" w:cs="Times New Roman"/>
+          <w:sz w:val="20"/>
+          <w:szCs w:val="24"/>
+        </w:rPr>
+        <w:t xml:space="preserve">com área de </w:t>
+      </w:r>
+      <w:r>
+        <w:rPr>
+          <w:rFonts w:ascii="Times New Roman" w:hAnsi="Times New Roman" w:cs="Times New Roman"/>
+          <w:bCs/>
+          <w:sz w:val="20"/>
+          <w:szCs w:val="24"/>
+        </w:rPr>
         <w:t>{{</w:t>
       </w:r>
-      <w:r>
-        <w:rPr>
-          <w:rFonts w:ascii="Times New Roman" w:hAnsi="Times New Roman" w:cs="Times New Roman"/>
-          <w:b/>
-          <w:sz w:val="20"/>
-          <w:szCs w:val="24"/>
-        </w:rPr>
-        <w:t>nirf_terra</w:t>
-      </w:r>
-      <w:r>
-        <w:rPr>
-          <w:rFonts w:ascii="Times New Roman" w:hAnsi="Times New Roman" w:cs="Times New Roman"/>
-          <w:b/>
-          <w:sz w:val="20"/>
-          <w:szCs w:val="24"/>
-        </w:rPr>
-        <w:t>}}</w:t>
-      </w:r>
-      <w:r>
-        <w:rPr>
-          <w:rFonts w:ascii="Times New Roman" w:hAnsi="Times New Roman" w:cs="Times New Roman"/>
-          <w:b/>
+      <w:proofErr w:type="spellStart"/>
+      <w:r>
+        <w:rPr>
+          <w:rFonts w:ascii="Times New Roman" w:hAnsi="Times New Roman" w:cs="Times New Roman"/>
+          <w:bCs/>
+          <w:sz w:val="20"/>
+          <w:szCs w:val="24"/>
+        </w:rPr>
+        <w:t>tamanho_trerra_numeros</w:t>
+      </w:r>
+      <w:proofErr w:type="spellEnd"/>
+      <w:r>
+        <w:rPr>
+          <w:rFonts w:ascii="Times New Roman" w:hAnsi="Times New Roman" w:cs="Times New Roman"/>
+          <w:bCs/>
+          <w:sz w:val="20"/>
+          <w:szCs w:val="24"/>
+        </w:rPr>
+        <w:t>}}</w:t>
+      </w:r>
+      <w:r>
+        <w:rPr>
+          <w:rFonts w:ascii="Times New Roman" w:hAnsi="Times New Roman" w:cs="Times New Roman"/>
           <w:sz w:val="20"/>
           <w:szCs w:val="24"/>
         </w:rPr>
@@ -705,7 +1165,7 @@
           <w:sz w:val="20"/>
           <w:szCs w:val="24"/>
         </w:rPr>
-        <w:t xml:space="preserve">com área de </w:t>
+        <w:t>ha (</w:t>
       </w:r>
       <w:r>
         <w:rPr>
@@ -714,24 +1174,9 @@
           <w:sz w:val="20"/>
           <w:szCs w:val="24"/>
         </w:rPr>
-        <w:t>{{tamanho_trerra_numeros}}</w:t>
-      </w:r>
-      <w:r>
-        <w:rPr>
-          <w:rFonts w:ascii="Times New Roman" w:hAnsi="Times New Roman" w:cs="Times New Roman"/>
-          <w:sz w:val="20"/>
-          <w:szCs w:val="24"/>
-        </w:rPr>
-        <w:t xml:space="preserve"> </w:t>
-      </w:r>
-      <w:r>
-        <w:rPr>
-          <w:rFonts w:ascii="Times New Roman" w:hAnsi="Times New Roman" w:cs="Times New Roman"/>
-          <w:sz w:val="20"/>
-          <w:szCs w:val="24"/>
-        </w:rPr>
-        <w:t>ha (</w:t>
-      </w:r>
+        <w:t>{{</w:t>
+      </w:r>
+      <w:proofErr w:type="spellStart"/>
       <w:r>
         <w:rPr>
           <w:rFonts w:ascii="Times New Roman" w:hAnsi="Times New Roman" w:cs="Times New Roman"/>
@@ -739,7 +1184,17 @@
           <w:sz w:val="20"/>
           <w:szCs w:val="24"/>
         </w:rPr>
-        <w:t>{{tamanho_terra_letras}});</w:t>
+        <w:t>tamanho_terra_letras</w:t>
+      </w:r>
+      <w:proofErr w:type="spellEnd"/>
+      <w:r>
+        <w:rPr>
+          <w:rFonts w:ascii="Times New Roman" w:hAnsi="Times New Roman" w:cs="Times New Roman"/>
+          <w:bCs/>
+          <w:sz w:val="20"/>
+          <w:szCs w:val="24"/>
+        </w:rPr>
+        <w:t>}});</w:t>
       </w:r>
     </w:p>
     <w:p>
@@ -834,6 +1289,7 @@
         </w:rPr>
         <w:t>{{</w:t>
       </w:r>
+      <w:proofErr w:type="spellStart"/>
       <w:r>
         <w:rPr>
           <w:rFonts w:ascii="Times New Roman" w:hAnsi="Times New Roman" w:cs="Times New Roman"/>
@@ -843,6 +1299,7 @@
         </w:rPr>
         <w:t>oque_produz</w:t>
       </w:r>
+      <w:proofErr w:type="spellEnd"/>
       <w:r>
         <w:rPr>
           <w:rFonts w:ascii="Times New Roman" w:hAnsi="Times New Roman" w:cs="Times New Roman"/>
@@ -877,6 +1334,7 @@
         </w:rPr>
         <w:t>{{</w:t>
       </w:r>
+      <w:proofErr w:type="spellStart"/>
       <w:r>
         <w:rPr>
           <w:rFonts w:ascii="Times New Roman" w:hAnsi="Times New Roman" w:cs="Times New Roman"/>
@@ -886,6 +1344,7 @@
         </w:rPr>
         <w:t>tamanho_utilizado_numeros</w:t>
       </w:r>
+      <w:proofErr w:type="spellEnd"/>
       <w:r>
         <w:rPr>
           <w:rFonts w:ascii="Times New Roman" w:hAnsi="Times New Roman" w:cs="Times New Roman"/>
@@ -928,6 +1387,7 @@
         </w:rPr>
         <w:t>{{</w:t>
       </w:r>
+      <w:proofErr w:type="spellStart"/>
       <w:r>
         <w:rPr>
           <w:rFonts w:ascii="Times New Roman" w:hAnsi="Times New Roman" w:cs="Times New Roman"/>
@@ -937,6 +1397,7 @@
         </w:rPr>
         <w:t>tamanho_utilizado_letras</w:t>
       </w:r>
+      <w:proofErr w:type="spellEnd"/>
       <w:r>
         <w:rPr>
           <w:rFonts w:ascii="Times New Roman" w:hAnsi="Times New Roman" w:cs="Times New Roman"/>
@@ -1005,6 +1466,7 @@
         </w:rPr>
         <w:t>{{</w:t>
       </w:r>
+      <w:proofErr w:type="spellStart"/>
       <w:r>
         <w:rPr>
           <w:rFonts w:ascii="Times New Roman" w:hAnsi="Times New Roman" w:cs="Times New Roman"/>
@@ -1014,6 +1476,7 @@
         </w:rPr>
         <w:t>duração_contrato</w:t>
       </w:r>
+      <w:proofErr w:type="spellEnd"/>
       <w:r>
         <w:rPr>
           <w:rFonts w:ascii="Times New Roman" w:hAnsi="Times New Roman" w:cs="Times New Roman"/>
@@ -1100,6 +1563,7 @@
         </w:rPr>
         <w:t>{{</w:t>
       </w:r>
+      <w:proofErr w:type="spellStart"/>
       <w:r>
         <w:rPr>
           <w:rFonts w:ascii="Times New Roman" w:hAnsi="Times New Roman" w:cs="Times New Roman"/>
@@ -1109,6 +1573,7 @@
         </w:rPr>
         <w:t>data_inicio</w:t>
       </w:r>
+      <w:proofErr w:type="spellEnd"/>
       <w:r>
         <w:rPr>
           <w:rFonts w:ascii="Times New Roman" w:hAnsi="Times New Roman" w:cs="Times New Roman"/>
@@ -1452,7 +1917,27 @@
           <w:sz w:val="20"/>
           <w:szCs w:val="24"/>
         </w:rPr>
-        <w:t>{{mes}}</w:t>
+        <w:t>{{</w:t>
+      </w:r>
+      <w:proofErr w:type="spellStart"/>
+      <w:r>
+        <w:rPr>
+          <w:rFonts w:ascii="Times New Roman" w:hAnsi="Times New Roman" w:cs="Times New Roman"/>
+          <w:bCs/>
+          <w:sz w:val="20"/>
+          <w:szCs w:val="24"/>
+        </w:rPr>
+        <w:t>mes</w:t>
+      </w:r>
+      <w:proofErr w:type="spellEnd"/>
+      <w:r>
+        <w:rPr>
+          <w:rFonts w:ascii="Times New Roman" w:hAnsi="Times New Roman" w:cs="Times New Roman"/>
+          <w:bCs/>
+          <w:sz w:val="20"/>
+          <w:szCs w:val="24"/>
+        </w:rPr>
+        <w:t>}}</w:t>
       </w:r>
       <w:r>
         <w:rPr>
@@ -1671,6 +2156,12 @@
     <w:sectPr>
       <w:pgSz w:w="11906" w:h="16838"/>
       <w:pgMar w:top="709" w:right="1701" w:bottom="1417" w:left="1701" w:header="708" w:footer="708" w:gutter="0"/>
+      <w:pgBorders w:offsetFrom="page">
+        <w:top w:val="single" w:sz="6" w:space="24" w:color="auto"/>
+        <w:left w:val="single" w:sz="6" w:space="24" w:color="auto"/>
+        <w:bottom w:val="single" w:sz="6" w:space="24" w:color="auto"/>
+        <w:right w:val="single" w:sz="6" w:space="24" w:color="auto"/>
+      </w:pgBorders>
       <w:cols w:space="708"/>
       <w:docGrid w:linePitch="360"/>
     </w:sectPr>

</xml_diff>